<commit_message>
docs: registro del hito 2 coherente con las reglas de firestore
</commit_message>
<xml_diff>
--- a/docs/hito2/Hito2_Saman_Deportivo.docx
+++ b/docs/hito2/Hito2_Saman_Deportivo.docx
@@ -56,7 +56,7 @@
           <w:noProof/>
         </w:rPr>
         <w:drawing>
-          <wp:inline distT="0" distB="0" distL="0" distR="0" wp14:anchorId="59AD48F7" wp14:editId="67D5184D">
+          <wp:inline distT="0" distB="0" distL="0" distR="0" wp14:anchorId="7B7727B5" wp14:editId="253B3D06">
             <wp:extent cx="4191000" cy="1733550"/>
             <wp:effectExtent l="0" t="0" r="0" b="0"/>
             <wp:docPr id="1" name="logo" descr="Logo de Samán Deportivo" title="Logo"/>
@@ -641,7 +641,7 @@
     <w:sdt>
       <w:sdtPr>
         <w:alias w:val="Contenido"/>
-        <w:id w:val="1193963743"/>
+        <w:id w:val="-659921027"/>
       </w:sdtPr>
       <w:sdtEndPr/>
       <w:sdtContent>
@@ -664,7 +664,7 @@
           <w:r>
             <w:fldChar w:fldCharType="separate"/>
           </w:r>
-          <w:hyperlink w:anchor="_Toc243596201" w:history="1">
+          <w:hyperlink w:anchor="_Toc243596804" w:history="1">
             <w:r>
               <w:rPr>
                 <w:rStyle w:val="Hipervnculo"/>
@@ -688,7 +688,7 @@
               <w:rPr>
                 <w:noProof/>
               </w:rPr>
-              <w:instrText xml:space="preserve"> PAGEREF _Toc243596201 \h </w:instrText>
+              <w:instrText xml:space="preserve"> PAGEREF _Toc243596804 \h </w:instrText>
             </w:r>
             <w:r>
               <w:rPr>
@@ -725,7 +725,7 @@
               <w:noProof/>
             </w:rPr>
           </w:pPr>
-          <w:hyperlink w:anchor="_Toc243596202" w:history="1">
+          <w:hyperlink w:anchor="_Toc243596805" w:history="1">
             <w:r>
               <w:rPr>
                 <w:rStyle w:val="Hipervnculo"/>
@@ -749,7 +749,7 @@
               <w:rPr>
                 <w:noProof/>
               </w:rPr>
-              <w:instrText xml:space="preserve"> PAGEREF _Toc243596202 \h </w:instrText>
+              <w:instrText xml:space="preserve"> PAGEREF _Toc243596805 \h </w:instrText>
             </w:r>
             <w:r>
               <w:rPr>
@@ -786,7 +786,7 @@
               <w:noProof/>
             </w:rPr>
           </w:pPr>
-          <w:hyperlink w:anchor="_Toc243596203" w:history="1">
+          <w:hyperlink w:anchor="_Toc243596806" w:history="1">
             <w:r>
               <w:rPr>
                 <w:rStyle w:val="Hipervnculo"/>
@@ -810,7 +810,7 @@
               <w:rPr>
                 <w:noProof/>
               </w:rPr>
-              <w:instrText xml:space="preserve"> PAGEREF _Toc243596203 \h </w:instrText>
+              <w:instrText xml:space="preserve"> PAGEREF _Toc243596806 \h </w:instrText>
             </w:r>
             <w:r>
               <w:rPr>
@@ -847,7 +847,7 @@
               <w:noProof/>
             </w:rPr>
           </w:pPr>
-          <w:hyperlink w:anchor="_Toc243596204" w:history="1">
+          <w:hyperlink w:anchor="_Toc243596807" w:history="1">
             <w:r>
               <w:rPr>
                 <w:rStyle w:val="Hipervnculo"/>
@@ -871,7 +871,7 @@
               <w:rPr>
                 <w:noProof/>
               </w:rPr>
-              <w:instrText xml:space="preserve"> PAGEREF _Toc243596204 \h </w:instrText>
+              <w:instrText xml:space="preserve"> PAGEREF _Toc243596807 \h </w:instrText>
             </w:r>
             <w:r>
               <w:rPr>
@@ -908,7 +908,7 @@
               <w:noProof/>
             </w:rPr>
           </w:pPr>
-          <w:hyperlink w:anchor="_Toc243596205" w:history="1">
+          <w:hyperlink w:anchor="_Toc243596808" w:history="1">
             <w:r>
               <w:rPr>
                 <w:rStyle w:val="Hipervnculo"/>
@@ -932,7 +932,7 @@
               <w:rPr>
                 <w:noProof/>
               </w:rPr>
-              <w:instrText xml:space="preserve"> PAGEREF _Toc243596205 \h </w:instrText>
+              <w:instrText xml:space="preserve"> PAGEREF _Toc243596808 \h </w:instrText>
             </w:r>
             <w:r>
               <w:rPr>
@@ -969,7 +969,7 @@
               <w:noProof/>
             </w:rPr>
           </w:pPr>
-          <w:hyperlink w:anchor="_Toc243596206" w:history="1">
+          <w:hyperlink w:anchor="_Toc243596809" w:history="1">
             <w:r>
               <w:rPr>
                 <w:rStyle w:val="Hipervnculo"/>
@@ -993,7 +993,7 @@
               <w:rPr>
                 <w:noProof/>
               </w:rPr>
-              <w:instrText xml:space="preserve"> PAGEREF _Toc243596206 \h </w:instrText>
+              <w:instrText xml:space="preserve"> PAGEREF _Toc243596809 \h </w:instrText>
             </w:r>
             <w:r>
               <w:rPr>
@@ -1030,7 +1030,7 @@
               <w:noProof/>
             </w:rPr>
           </w:pPr>
-          <w:hyperlink w:anchor="_Toc243596207" w:history="1">
+          <w:hyperlink w:anchor="_Toc243596810" w:history="1">
             <w:r>
               <w:rPr>
                 <w:rStyle w:val="Hipervnculo"/>
@@ -1054,7 +1054,7 @@
               <w:rPr>
                 <w:noProof/>
               </w:rPr>
-              <w:instrText xml:space="preserve"> PAGEREF _Toc243596207 \h </w:instrText>
+              <w:instrText xml:space="preserve"> PAGEREF _Toc243596810 \h </w:instrText>
             </w:r>
             <w:r>
               <w:rPr>
@@ -1091,7 +1091,7 @@
               <w:noProof/>
             </w:rPr>
           </w:pPr>
-          <w:hyperlink w:anchor="_Toc243596208" w:history="1">
+          <w:hyperlink w:anchor="_Toc243596811" w:history="1">
             <w:r>
               <w:rPr>
                 <w:rStyle w:val="Hipervnculo"/>
@@ -1115,7 +1115,7 @@
               <w:rPr>
                 <w:noProof/>
               </w:rPr>
-              <w:instrText xml:space="preserve"> PAGEREF _Toc243596208 \h </w:instrText>
+              <w:instrText xml:space="preserve"> PAGEREF _Toc243596811 \h </w:instrText>
             </w:r>
             <w:r>
               <w:rPr>
@@ -1152,7 +1152,7 @@
               <w:noProof/>
             </w:rPr>
           </w:pPr>
-          <w:hyperlink w:anchor="_Toc243596209" w:history="1">
+          <w:hyperlink w:anchor="_Toc243596812" w:history="1">
             <w:r>
               <w:rPr>
                 <w:rStyle w:val="Hipervnculo"/>
@@ -1176,7 +1176,7 @@
               <w:rPr>
                 <w:noProof/>
               </w:rPr>
-              <w:instrText xml:space="preserve"> PAGEREF _Toc243596209 \h </w:instrText>
+              <w:instrText xml:space="preserve"> PAGEREF _Toc243596812 \h </w:instrText>
             </w:r>
             <w:r>
               <w:rPr>
@@ -1213,7 +1213,7 @@
               <w:noProof/>
             </w:rPr>
           </w:pPr>
-          <w:hyperlink w:anchor="_Toc243596210" w:history="1">
+          <w:hyperlink w:anchor="_Toc243596813" w:history="1">
             <w:r>
               <w:rPr>
                 <w:rStyle w:val="Hipervnculo"/>
@@ -1237,7 +1237,7 @@
               <w:rPr>
                 <w:noProof/>
               </w:rPr>
-              <w:instrText xml:space="preserve"> PAGEREF _Toc243596210 \h </w:instrText>
+              <w:instrText xml:space="preserve"> PAGEREF _Toc243596813 \h </w:instrText>
             </w:r>
             <w:r>
               <w:rPr>
@@ -1274,7 +1274,7 @@
               <w:noProof/>
             </w:rPr>
           </w:pPr>
-          <w:hyperlink w:anchor="_Toc243596211" w:history="1">
+          <w:hyperlink w:anchor="_Toc243596814" w:history="1">
             <w:r>
               <w:rPr>
                 <w:rStyle w:val="Hipervnculo"/>
@@ -1298,7 +1298,7 @@
               <w:rPr>
                 <w:noProof/>
               </w:rPr>
-              <w:instrText xml:space="preserve"> PAGEREF _Toc243596211 \h </w:instrText>
+              <w:instrText xml:space="preserve"> PAGEREF _Toc243596814 \h </w:instrText>
             </w:r>
             <w:r>
               <w:rPr>
@@ -1335,7 +1335,7 @@
               <w:noProof/>
             </w:rPr>
           </w:pPr>
-          <w:hyperlink w:anchor="_Toc243596212" w:history="1">
+          <w:hyperlink w:anchor="_Toc243596815" w:history="1">
             <w:r>
               <w:rPr>
                 <w:rStyle w:val="Hipervnculo"/>
@@ -1359,7 +1359,7 @@
               <w:rPr>
                 <w:noProof/>
               </w:rPr>
-              <w:instrText xml:space="preserve"> PAGEREF _Toc243596212 \h </w:instrText>
+              <w:instrText xml:space="preserve"> PAGEREF _Toc243596815 \h </w:instrText>
             </w:r>
             <w:r>
               <w:rPr>
@@ -1396,7 +1396,7 @@
               <w:noProof/>
             </w:rPr>
           </w:pPr>
-          <w:hyperlink w:anchor="_Toc243596213" w:history="1">
+          <w:hyperlink w:anchor="_Toc243596816" w:history="1">
             <w:r>
               <w:rPr>
                 <w:rStyle w:val="Hipervnculo"/>
@@ -1420,7 +1420,7 @@
               <w:rPr>
                 <w:noProof/>
               </w:rPr>
-              <w:instrText xml:space="preserve"> PAGEREF _Toc243596213 \h </w:instrText>
+              <w:instrText xml:space="preserve"> PAGEREF _Toc243596816 \h </w:instrText>
             </w:r>
             <w:r>
               <w:rPr>
@@ -1457,7 +1457,7 @@
               <w:noProof/>
             </w:rPr>
           </w:pPr>
-          <w:hyperlink w:anchor="_Toc243596214" w:history="1">
+          <w:hyperlink w:anchor="_Toc243596817" w:history="1">
             <w:r>
               <w:rPr>
                 <w:rStyle w:val="Hipervnculo"/>
@@ -1481,7 +1481,7 @@
               <w:rPr>
                 <w:noProof/>
               </w:rPr>
-              <w:instrText xml:space="preserve"> PAGEREF _Toc243596214 \h </w:instrText>
+              <w:instrText xml:space="preserve"> PAGEREF _Toc243596817 \h </w:instrText>
             </w:r>
             <w:r>
               <w:rPr>
@@ -1518,7 +1518,7 @@
               <w:noProof/>
             </w:rPr>
           </w:pPr>
-          <w:hyperlink w:anchor="_Toc243596215" w:history="1">
+          <w:hyperlink w:anchor="_Toc243596818" w:history="1">
             <w:r>
               <w:rPr>
                 <w:rStyle w:val="Hipervnculo"/>
@@ -1542,7 +1542,7 @@
               <w:rPr>
                 <w:noProof/>
               </w:rPr>
-              <w:instrText xml:space="preserve"> PAGEREF _Toc243596215 \h </w:instrText>
+              <w:instrText xml:space="preserve"> PAGEREF _Toc243596818 \h </w:instrText>
             </w:r>
             <w:r>
               <w:rPr>
@@ -1579,7 +1579,7 @@
               <w:noProof/>
             </w:rPr>
           </w:pPr>
-          <w:hyperlink w:anchor="_Toc243596216" w:history="1">
+          <w:hyperlink w:anchor="_Toc243596819" w:history="1">
             <w:r>
               <w:rPr>
                 <w:rStyle w:val="Hipervnculo"/>
@@ -1603,7 +1603,7 @@
               <w:rPr>
                 <w:noProof/>
               </w:rPr>
-              <w:instrText xml:space="preserve"> PAGEREF _Toc243596216 \h </w:instrText>
+              <w:instrText xml:space="preserve"> PAGEREF _Toc243596819 \h </w:instrText>
             </w:r>
             <w:r>
               <w:rPr>
@@ -1640,7 +1640,7 @@
               <w:noProof/>
             </w:rPr>
           </w:pPr>
-          <w:hyperlink w:anchor="_Toc243596217" w:history="1">
+          <w:hyperlink w:anchor="_Toc243596820" w:history="1">
             <w:r>
               <w:rPr>
                 <w:rStyle w:val="Hipervnculo"/>
@@ -1664,7 +1664,7 @@
               <w:rPr>
                 <w:noProof/>
               </w:rPr>
-              <w:instrText xml:space="preserve"> PAGEREF _Toc243596217 \h </w:instrText>
+              <w:instrText xml:space="preserve"> PAGEREF _Toc243596820 \h </w:instrText>
             </w:r>
             <w:r>
               <w:rPr>
@@ -1701,7 +1701,7 @@
               <w:noProof/>
             </w:rPr>
           </w:pPr>
-          <w:hyperlink w:anchor="_Toc243596218" w:history="1">
+          <w:hyperlink w:anchor="_Toc243596821" w:history="1">
             <w:r>
               <w:rPr>
                 <w:rStyle w:val="Hipervnculo"/>
@@ -1725,7 +1725,7 @@
               <w:rPr>
                 <w:noProof/>
               </w:rPr>
-              <w:instrText xml:space="preserve"> PAGEREF _Toc243596218 \h </w:instrText>
+              <w:instrText xml:space="preserve"> PAGEREF _Toc243596821 \h </w:instrText>
             </w:r>
             <w:r>
               <w:rPr>
@@ -1762,7 +1762,7 @@
               <w:noProof/>
             </w:rPr>
           </w:pPr>
-          <w:hyperlink w:anchor="_Toc243596219" w:history="1">
+          <w:hyperlink w:anchor="_Toc243596822" w:history="1">
             <w:r>
               <w:rPr>
                 <w:rStyle w:val="Hipervnculo"/>
@@ -1786,7 +1786,7 @@
               <w:rPr>
                 <w:noProof/>
               </w:rPr>
-              <w:instrText xml:space="preserve"> PAGEREF _Toc243596219 \h </w:instrText>
+              <w:instrText xml:space="preserve"> PAGEREF _Toc243596822 \h </w:instrText>
             </w:r>
             <w:r>
               <w:rPr>
@@ -1823,7 +1823,7 @@
               <w:noProof/>
             </w:rPr>
           </w:pPr>
-          <w:hyperlink w:anchor="_Toc243596220" w:history="1">
+          <w:hyperlink w:anchor="_Toc243596823" w:history="1">
             <w:r>
               <w:rPr>
                 <w:rStyle w:val="Hipervnculo"/>
@@ -1847,7 +1847,7 @@
               <w:rPr>
                 <w:noProof/>
               </w:rPr>
-              <w:instrText xml:space="preserve"> PAGEREF _Toc243596220 \h </w:instrText>
+              <w:instrText xml:space="preserve"> PAGEREF _Toc243596823 \h </w:instrText>
             </w:r>
             <w:r>
               <w:rPr>
@@ -1884,7 +1884,7 @@
               <w:noProof/>
             </w:rPr>
           </w:pPr>
-          <w:hyperlink w:anchor="_Toc243596221" w:history="1">
+          <w:hyperlink w:anchor="_Toc243596824" w:history="1">
             <w:r>
               <w:rPr>
                 <w:rStyle w:val="Hipervnculo"/>
@@ -1908,7 +1908,7 @@
               <w:rPr>
                 <w:noProof/>
               </w:rPr>
-              <w:instrText xml:space="preserve"> PAGEREF _Toc243596221 \h </w:instrText>
+              <w:instrText xml:space="preserve"> PAGEREF _Toc243596824 \h </w:instrText>
             </w:r>
             <w:r>
               <w:rPr>
@@ -1925,7 +1925,7 @@
               <w:rPr>
                 <w:noProof/>
               </w:rPr>
-              <w:t>18</w:t>
+              <w:t>19</w:t>
             </w:r>
             <w:r>
               <w:rPr>
@@ -1945,7 +1945,7 @@
               <w:noProof/>
             </w:rPr>
           </w:pPr>
-          <w:hyperlink w:anchor="_Toc243596222" w:history="1">
+          <w:hyperlink w:anchor="_Toc243596825" w:history="1">
             <w:r>
               <w:rPr>
                 <w:rStyle w:val="Hipervnculo"/>
@@ -1969,7 +1969,7 @@
               <w:rPr>
                 <w:noProof/>
               </w:rPr>
-              <w:instrText xml:space="preserve"> PAGEREF _Toc243596222 \h </w:instrText>
+              <w:instrText xml:space="preserve"> PAGEREF _Toc243596825 \h </w:instrText>
             </w:r>
             <w:r>
               <w:rPr>
@@ -1986,7 +1986,7 @@
               <w:rPr>
                 <w:noProof/>
               </w:rPr>
-              <w:t>18</w:t>
+              <w:t>19</w:t>
             </w:r>
             <w:r>
               <w:rPr>
@@ -2006,7 +2006,7 @@
               <w:noProof/>
             </w:rPr>
           </w:pPr>
-          <w:hyperlink w:anchor="_Toc243596223" w:history="1">
+          <w:hyperlink w:anchor="_Toc243596826" w:history="1">
             <w:r>
               <w:rPr>
                 <w:rStyle w:val="Hipervnculo"/>
@@ -2030,7 +2030,7 @@
               <w:rPr>
                 <w:noProof/>
               </w:rPr>
-              <w:instrText xml:space="preserve"> PAGEREF _Toc243596223 \h </w:instrText>
+              <w:instrText xml:space="preserve"> PAGEREF _Toc243596826 \h </w:instrText>
             </w:r>
             <w:r>
               <w:rPr>
@@ -2047,7 +2047,7 @@
               <w:rPr>
                 <w:noProof/>
               </w:rPr>
-              <w:t>21</w:t>
+              <w:t>22</w:t>
             </w:r>
             <w:r>
               <w:rPr>
@@ -2067,7 +2067,7 @@
               <w:noProof/>
             </w:rPr>
           </w:pPr>
-          <w:hyperlink w:anchor="_Toc243596224" w:history="1">
+          <w:hyperlink w:anchor="_Toc243596827" w:history="1">
             <w:r>
               <w:rPr>
                 <w:rStyle w:val="Hipervnculo"/>
@@ -2091,7 +2091,7 @@
               <w:rPr>
                 <w:noProof/>
               </w:rPr>
-              <w:instrText xml:space="preserve"> PAGEREF _Toc243596224 \h </w:instrText>
+              <w:instrText xml:space="preserve"> PAGEREF _Toc243596827 \h </w:instrText>
             </w:r>
             <w:r>
               <w:rPr>
@@ -2108,7 +2108,7 @@
               <w:rPr>
                 <w:noProof/>
               </w:rPr>
-              <w:t>24</w:t>
+              <w:t>25</w:t>
             </w:r>
             <w:r>
               <w:rPr>
@@ -2128,7 +2128,7 @@
               <w:noProof/>
             </w:rPr>
           </w:pPr>
-          <w:hyperlink w:anchor="_Toc243596225" w:history="1">
+          <w:hyperlink w:anchor="_Toc243596828" w:history="1">
             <w:r>
               <w:rPr>
                 <w:rStyle w:val="Hipervnculo"/>
@@ -2152,7 +2152,7 @@
               <w:rPr>
                 <w:noProof/>
               </w:rPr>
-              <w:instrText xml:space="preserve"> PAGEREF _Toc243596225 \h </w:instrText>
+              <w:instrText xml:space="preserve"> PAGEREF _Toc243596828 \h </w:instrText>
             </w:r>
             <w:r>
               <w:rPr>
@@ -2169,7 +2169,7 @@
               <w:rPr>
                 <w:noProof/>
               </w:rPr>
-              <w:t>25</w:t>
+              <w:t>26</w:t>
             </w:r>
             <w:r>
               <w:rPr>
@@ -2189,7 +2189,7 @@
               <w:noProof/>
             </w:rPr>
           </w:pPr>
-          <w:hyperlink w:anchor="_Toc243596226" w:history="1">
+          <w:hyperlink w:anchor="_Toc243596829" w:history="1">
             <w:r>
               <w:rPr>
                 <w:rStyle w:val="Hipervnculo"/>
@@ -2213,7 +2213,7 @@
               <w:rPr>
                 <w:noProof/>
               </w:rPr>
-              <w:instrText xml:space="preserve"> PAGEREF _Toc243596226 \h </w:instrText>
+              <w:instrText xml:space="preserve"> PAGEREF _Toc243596829 \h </w:instrText>
             </w:r>
             <w:r>
               <w:rPr>
@@ -2230,7 +2230,7 @@
               <w:rPr>
                 <w:noProof/>
               </w:rPr>
-              <w:t>29</w:t>
+              <w:t>30</w:t>
             </w:r>
             <w:r>
               <w:rPr>
@@ -2250,7 +2250,7 @@
               <w:noProof/>
             </w:rPr>
           </w:pPr>
-          <w:hyperlink w:anchor="_Toc243596227" w:history="1">
+          <w:hyperlink w:anchor="_Toc243596830" w:history="1">
             <w:r>
               <w:rPr>
                 <w:rStyle w:val="Hipervnculo"/>
@@ -2274,7 +2274,7 @@
               <w:rPr>
                 <w:noProof/>
               </w:rPr>
-              <w:instrText xml:space="preserve"> PAGEREF _Toc243596227 \h </w:instrText>
+              <w:instrText xml:space="preserve"> PAGEREF _Toc243596830 \h </w:instrText>
             </w:r>
             <w:r>
               <w:rPr>
@@ -2291,7 +2291,7 @@
               <w:rPr>
                 <w:noProof/>
               </w:rPr>
-              <w:t>30</w:t>
+              <w:t>31</w:t>
             </w:r>
             <w:r>
               <w:rPr>
@@ -2311,7 +2311,7 @@
               <w:noProof/>
             </w:rPr>
           </w:pPr>
-          <w:hyperlink w:anchor="_Toc243596228" w:history="1">
+          <w:hyperlink w:anchor="_Toc243596831" w:history="1">
             <w:r>
               <w:rPr>
                 <w:rStyle w:val="Hipervnculo"/>
@@ -2335,7 +2335,7 @@
               <w:rPr>
                 <w:noProof/>
               </w:rPr>
-              <w:instrText xml:space="preserve"> PAGEREF _Toc243596228 \h </w:instrText>
+              <w:instrText xml:space="preserve"> PAGEREF _Toc243596831 \h </w:instrText>
             </w:r>
             <w:r>
               <w:rPr>
@@ -2352,7 +2352,7 @@
               <w:rPr>
                 <w:noProof/>
               </w:rPr>
-              <w:t>31</w:t>
+              <w:t>32</w:t>
             </w:r>
             <w:r>
               <w:rPr>
@@ -2372,7 +2372,7 @@
               <w:noProof/>
             </w:rPr>
           </w:pPr>
-          <w:hyperlink w:anchor="_Toc243596229" w:history="1">
+          <w:hyperlink w:anchor="_Toc243596832" w:history="1">
             <w:r>
               <w:rPr>
                 <w:rStyle w:val="Hipervnculo"/>
@@ -2396,7 +2396,7 @@
               <w:rPr>
                 <w:noProof/>
               </w:rPr>
-              <w:instrText xml:space="preserve"> PAGEREF _Toc243596229 \h </w:instrText>
+              <w:instrText xml:space="preserve"> PAGEREF _Toc243596832 \h </w:instrText>
             </w:r>
             <w:r>
               <w:rPr>
@@ -2413,7 +2413,7 @@
               <w:rPr>
                 <w:noProof/>
               </w:rPr>
-              <w:t>32</w:t>
+              <w:t>33</w:t>
             </w:r>
             <w:r>
               <w:rPr>
@@ -2433,7 +2433,7 @@
               <w:noProof/>
             </w:rPr>
           </w:pPr>
-          <w:hyperlink w:anchor="_Toc243596230" w:history="1">
+          <w:hyperlink w:anchor="_Toc243596833" w:history="1">
             <w:r>
               <w:rPr>
                 <w:rStyle w:val="Hipervnculo"/>
@@ -2457,7 +2457,7 @@
               <w:rPr>
                 <w:noProof/>
               </w:rPr>
-              <w:instrText xml:space="preserve"> PAGEREF _Toc243596230 \h </w:instrText>
+              <w:instrText xml:space="preserve"> PAGEREF _Toc243596833 \h </w:instrText>
             </w:r>
             <w:r>
               <w:rPr>
@@ -2474,7 +2474,7 @@
               <w:rPr>
                 <w:noProof/>
               </w:rPr>
-              <w:t>32</w:t>
+              <w:t>33</w:t>
             </w:r>
             <w:r>
               <w:rPr>
@@ -2494,7 +2494,7 @@
               <w:noProof/>
             </w:rPr>
           </w:pPr>
-          <w:hyperlink w:anchor="_Toc243596231" w:history="1">
+          <w:hyperlink w:anchor="_Toc243596834" w:history="1">
             <w:r>
               <w:rPr>
                 <w:rStyle w:val="Hipervnculo"/>
@@ -2518,7 +2518,7 @@
               <w:rPr>
                 <w:noProof/>
               </w:rPr>
-              <w:instrText xml:space="preserve"> PAGEREF _Toc243596231 \h </w:instrText>
+              <w:instrText xml:space="preserve"> PAGEREF _Toc243596834 \h </w:instrText>
             </w:r>
             <w:r>
               <w:rPr>
@@ -2535,7 +2535,7 @@
               <w:rPr>
                 <w:noProof/>
               </w:rPr>
-              <w:t>33</w:t>
+              <w:t>34</w:t>
             </w:r>
             <w:r>
               <w:rPr>
@@ -2555,7 +2555,7 @@
               <w:noProof/>
             </w:rPr>
           </w:pPr>
-          <w:hyperlink w:anchor="_Toc243596232" w:history="1">
+          <w:hyperlink w:anchor="_Toc243596835" w:history="1">
             <w:r>
               <w:rPr>
                 <w:rStyle w:val="Hipervnculo"/>
@@ -2579,7 +2579,7 @@
               <w:rPr>
                 <w:noProof/>
               </w:rPr>
-              <w:instrText xml:space="preserve"> PAGEREF _Toc243596232 \h </w:instrText>
+              <w:instrText xml:space="preserve"> PAGEREF _Toc243596835 \h </w:instrText>
             </w:r>
             <w:r>
               <w:rPr>
@@ -2596,7 +2596,7 @@
               <w:rPr>
                 <w:noProof/>
               </w:rPr>
-              <w:t>34</w:t>
+              <w:t>35</w:t>
             </w:r>
             <w:r>
               <w:rPr>
@@ -2616,7 +2616,7 @@
               <w:noProof/>
             </w:rPr>
           </w:pPr>
-          <w:hyperlink w:anchor="_Toc243596233" w:history="1">
+          <w:hyperlink w:anchor="_Toc243596836" w:history="1">
             <w:r>
               <w:rPr>
                 <w:rStyle w:val="Hipervnculo"/>
@@ -2640,7 +2640,7 @@
               <w:rPr>
                 <w:noProof/>
               </w:rPr>
-              <w:instrText xml:space="preserve"> PAGEREF _Toc243596233 \h </w:instrText>
+              <w:instrText xml:space="preserve"> PAGEREF _Toc243596836 \h </w:instrText>
             </w:r>
             <w:r>
               <w:rPr>
@@ -2657,7 +2657,7 @@
               <w:rPr>
                 <w:noProof/>
               </w:rPr>
-              <w:t>34</w:t>
+              <w:t>35</w:t>
             </w:r>
             <w:r>
               <w:rPr>
@@ -2695,7 +2695,7 @@
         <w:pStyle w:val="Ttulo1"/>
         <w:pageBreakBefore/>
       </w:pPr>
-      <w:bookmarkStart w:id="0" w:name="_Toc243596201"/>
+      <w:bookmarkStart w:id="0" w:name="_Toc243596804"/>
       <w:r>
         <w:lastRenderedPageBreak/>
         <w:t>1. Introducción</w:t>
@@ -2706,7 +2706,7 @@
       <w:pPr>
         <w:pStyle w:val="Ttulo2"/>
       </w:pPr>
-      <w:bookmarkStart w:id="1" w:name="_Toc243596202"/>
+      <w:bookmarkStart w:id="1" w:name="_Toc243596805"/>
       <w:r>
         <w:t>1.1 Propósito del documento</w:t>
       </w:r>
@@ -2777,7 +2777,7 @@
       <w:pPr>
         <w:pStyle w:val="Ttulo2"/>
       </w:pPr>
-      <w:bookmarkStart w:id="2" w:name="_Toc243596203"/>
+      <w:bookmarkStart w:id="2" w:name="_Toc243596806"/>
       <w:r>
         <w:t>1.2 Entregables del Hito 2 y dónde se encuentran</w:t>
       </w:r>
@@ -3663,7 +3663,7 @@
       <w:pPr>
         <w:pStyle w:val="Ttulo2"/>
       </w:pPr>
-      <w:bookmarkStart w:id="3" w:name="_Toc243596204"/>
+      <w:bookmarkStart w:id="3" w:name="_Toc243596807"/>
       <w:r>
         <w:t>1.3 Cambios respecto al Hito 1</w:t>
       </w:r>
@@ -3729,7 +3729,7 @@
         <w:pStyle w:val="Ttulo1"/>
         <w:pageBreakBefore/>
       </w:pPr>
-      <w:bookmarkStart w:id="4" w:name="_Toc243596205"/>
+      <w:bookmarkStart w:id="4" w:name="_Toc243596808"/>
       <w:r>
         <w:lastRenderedPageBreak/>
         <w:t>2. Requerimientos del sistema</w:t>
@@ -3770,7 +3770,7 @@
       <w:pPr>
         <w:pStyle w:val="Ttulo2"/>
       </w:pPr>
-      <w:bookmarkStart w:id="5" w:name="_Toc243596206"/>
+      <w:bookmarkStart w:id="5" w:name="_Toc243596809"/>
       <w:r>
         <w:lastRenderedPageBreak/>
         <w:t>2.1 Requerimientos funcionales</w:t>
@@ -7860,7 +7860,7 @@
       <w:pPr>
         <w:pStyle w:val="Ttulo2"/>
       </w:pPr>
-      <w:bookmarkStart w:id="6" w:name="_Toc243596207"/>
+      <w:bookmarkStart w:id="6" w:name="_Toc243596810"/>
       <w:r>
         <w:t>2.2 Requerimientos no funcionales</w:t>
       </w:r>
@@ -9394,7 +9394,7 @@
       <w:pPr>
         <w:pStyle w:val="Ttulo2"/>
       </w:pPr>
-      <w:bookmarkStart w:id="7" w:name="_Toc243596208"/>
+      <w:bookmarkStart w:id="7" w:name="_Toc243596811"/>
       <w:r>
         <w:lastRenderedPageBreak/>
         <w:t>2.3 Trazabilidad con el Hito 1</w:t>
@@ -11327,7 +11327,7 @@
         <w:pStyle w:val="Ttulo1"/>
         <w:pageBreakBefore/>
       </w:pPr>
-      <w:bookmarkStart w:id="8" w:name="_Toc243596209"/>
+      <w:bookmarkStart w:id="8" w:name="_Toc243596812"/>
       <w:r>
         <w:lastRenderedPageBreak/>
         <w:t>3. Arquitectura del sistema</w:t>
@@ -11338,7 +11338,7 @@
       <w:pPr>
         <w:pStyle w:val="Ttulo2"/>
       </w:pPr>
-      <w:bookmarkStart w:id="9" w:name="_Toc243596210"/>
+      <w:bookmarkStart w:id="9" w:name="_Toc243596813"/>
       <w:r>
         <w:t>3.1 Vista general</w:t>
       </w:r>
@@ -11376,7 +11376,7 @@
           <w:noProof/>
         </w:rPr>
         <w:drawing>
-          <wp:inline distT="0" distB="0" distL="0" distR="0" wp14:anchorId="75122360" wp14:editId="53E41F2C">
+          <wp:inline distT="0" distB="0" distL="0" distR="0" wp14:anchorId="6CA0C2CE" wp14:editId="6E5E3871">
             <wp:extent cx="5943600" cy="3448050"/>
             <wp:effectExtent l="0" t="0" r="0" b="0"/>
             <wp:docPr id="2" name="13_arquitectura.png" descr="Vista general de la arquitectura: app Flutter por capas sobre los servicios de Firebase." title="Vista general de la arquitectura: app Flutter por capas sobre los servicios de Firebase."/>
@@ -11455,7 +11455,7 @@
       <w:pPr>
         <w:pStyle w:val="Ttulo2"/>
       </w:pPr>
-      <w:bookmarkStart w:id="10" w:name="_Toc243596211"/>
+      <w:bookmarkStart w:id="10" w:name="_Toc243596814"/>
       <w:r>
         <w:t>3.2 Línea base de la arquitectura del cliente</w:t>
       </w:r>
@@ -11610,7 +11610,7 @@
         </w:rPr>
         <w:lastRenderedPageBreak/>
         <w:drawing>
-          <wp:inline distT="0" distB="0" distL="0" distR="0" wp14:anchorId="718CBA37" wp14:editId="3ED0CB03">
+          <wp:inline distT="0" distB="0" distL="0" distR="0" wp14:anchorId="2FA83E90" wp14:editId="6474E95C">
             <wp:extent cx="6096000" cy="2781300"/>
             <wp:effectExtent l="0" t="0" r="0" b="0"/>
             <wp:docPr id="3" name="14_capas_mvvm.png" descr="Línea base de la arquitectura del cliente: capas MVVM y repositorios." title="Línea base de la arquitectura del cliente: capas MVVM y repositorios."/>
@@ -11679,7 +11679,7 @@
       <w:pPr>
         <w:pStyle w:val="Ttulo2"/>
       </w:pPr>
-      <w:bookmarkStart w:id="11" w:name="_Toc243596212"/>
+      <w:bookmarkStart w:id="11" w:name="_Toc243596815"/>
       <w:r>
         <w:t>3.3 Estructura del código</w:t>
       </w:r>
@@ -12558,7 +12558,7 @@
       <w:pPr>
         <w:pStyle w:val="Ttulo2"/>
       </w:pPr>
-      <w:bookmarkStart w:id="12" w:name="_Toc243596213"/>
+      <w:bookmarkStart w:id="12" w:name="_Toc243596816"/>
       <w:r>
         <w:lastRenderedPageBreak/>
         <w:t>3.4 Navegación y guardia de rutas</w:t>
@@ -12587,7 +12587,7 @@
           <w:noProof/>
         </w:rPr>
         <w:drawing>
-          <wp:inline distT="0" distB="0" distL="0" distR="0" wp14:anchorId="6B0915D1" wp14:editId="5696EA10">
+          <wp:inline distT="0" distB="0" distL="0" distR="0" wp14:anchorId="74296076" wp14:editId="72667A3D">
             <wp:extent cx="5334000" cy="2209800"/>
             <wp:effectExtent l="0" t="0" r="0" b="0"/>
             <wp:docPr id="4" name="20_guardia_rutas.png" descr="Diagrama de actividad de la guardia de rutas por rol." title="Diagrama de actividad de la guardia de rutas por rol."/>
@@ -13257,7 +13257,7 @@
       <w:pPr>
         <w:pStyle w:val="Ttulo2"/>
       </w:pPr>
-      <w:bookmarkStart w:id="13" w:name="_Toc243596214"/>
+      <w:bookmarkStart w:id="13" w:name="_Toc243596817"/>
       <w:r>
         <w:t>3.5 Librerías utilizadas</w:t>
       </w:r>
@@ -13746,7 +13746,7 @@
         <w:pStyle w:val="Ttulo1"/>
         <w:pageBreakBefore/>
       </w:pPr>
-      <w:bookmarkStart w:id="14" w:name="_Toc243596215"/>
+      <w:bookmarkStart w:id="14" w:name="_Toc243596818"/>
       <w:r>
         <w:lastRenderedPageBreak/>
         <w:t>4. Patrones de diseño</w:t>
@@ -14918,7 +14918,7 @@
       <w:pPr>
         <w:pStyle w:val="Ttulo2"/>
       </w:pPr>
-      <w:bookmarkStart w:id="15" w:name="_Toc243596216"/>
+      <w:bookmarkStart w:id="15" w:name="_Toc243596819"/>
       <w:r>
         <w:t>4.1 Diagrama de clases de diseño del módulo de autenticación</w:t>
       </w:r>
@@ -14944,7 +14944,7 @@
         </w:rPr>
         <w:lastRenderedPageBreak/>
         <w:drawing>
-          <wp:inline distT="0" distB="0" distL="0" distR="0" wp14:anchorId="769E3A75" wp14:editId="2F3581C2">
+          <wp:inline distT="0" distB="0" distL="0" distR="0" wp14:anchorId="606C5B3D" wp14:editId="37F50E59">
             <wp:extent cx="5943600" cy="5572125"/>
             <wp:effectExtent l="0" t="0" r="0" b="0"/>
             <wp:docPr id="5" name="15_clases_autenticacion.png" descr="Diagrama de clases de diseño del módulo de autenticación y perfil." title="Diagrama de clases de diseño del módulo de autenticación y perfil."/>
@@ -15024,7 +15024,7 @@
         <w:pStyle w:val="Ttulo1"/>
         <w:pageBreakBefore/>
       </w:pPr>
-      <w:bookmarkStart w:id="16" w:name="_Toc243596217"/>
+      <w:bookmarkStart w:id="16" w:name="_Toc243596820"/>
       <w:r>
         <w:lastRenderedPageBreak/>
         <w:t>5. Modelo de datos y backend en Firebase</w:t>
@@ -15035,7 +15035,7 @@
       <w:pPr>
         <w:pStyle w:val="Ttulo2"/>
       </w:pPr>
-      <w:bookmarkStart w:id="17" w:name="_Toc243596218"/>
+      <w:bookmarkStart w:id="17" w:name="_Toc243596821"/>
       <w:r>
         <w:t>5.1 Colecciones de Cloud Firestore</w:t>
       </w:r>
@@ -15066,7 +15066,7 @@
           <w:noProof/>
         </w:rPr>
         <w:drawing>
-          <wp:inline distT="0" distB="0" distL="0" distR="0" wp14:anchorId="32BFAEA4" wp14:editId="7E9BA822">
+          <wp:inline distT="0" distB="0" distL="0" distR="0" wp14:anchorId="4F344858" wp14:editId="23C833E8">
             <wp:extent cx="3905250" cy="6096000"/>
             <wp:effectExtent l="0" t="0" r="0" b="0"/>
             <wp:docPr id="6" name="21_modelo_firestore.png" descr="Modelo de datos en Cloud Firestore." title="Modelo de datos en Cloud Firestore."/>
@@ -15135,7 +15135,7 @@
       <w:pPr>
         <w:pStyle w:val="Ttulo2"/>
       </w:pPr>
-      <w:bookmarkStart w:id="18" w:name="_Toc243596219"/>
+      <w:bookmarkStart w:id="18" w:name="_Toc243596822"/>
       <w:r>
         <w:lastRenderedPageBreak/>
         <w:t>5.2 Reglas de seguridad propuestas</w:t>
@@ -15531,7 +15531,7 @@
       <w:pPr>
         <w:pStyle w:val="Ttulo2"/>
       </w:pPr>
-      <w:bookmarkStart w:id="19" w:name="_Toc243596220"/>
+      <w:bookmarkStart w:id="19" w:name="_Toc243596823"/>
       <w:r>
         <w:t>5.3 Configuración ini</w:t>
       </w:r>
@@ -15683,7 +15683,14 @@
                 <w:sz w:val="19"/>
                 <w:szCs w:val="19"/>
               </w:rPr>
-              <w:t>Escribir AuthRepositoryFirebase siguiendo las secuencias de las figuras 6 a 9, y cambiar la línea de main.dart.</w:t>
+              <w:t>Escribir AuthRepositoryFirebase siguiendo las secuencias de las figuras 6 a 9 (en el registro, la escritura en lote con los índic</w:t>
+            </w:r>
+            <w:r>
+              <w:rPr>
+                <w:sz w:val="19"/>
+                <w:szCs w:val="19"/>
+              </w:rPr>
+              <w:t>es de cédula y carnet), y cambiar la línea de main.dart.</w:t>
             </w:r>
           </w:p>
           <w:p>
@@ -15733,7 +15740,7 @@
         <w:pStyle w:val="Ttulo1"/>
         <w:pageBreakBefore/>
       </w:pPr>
-      <w:bookmarkStart w:id="20" w:name="_Toc243596221"/>
+      <w:bookmarkStart w:id="20" w:name="_Toc243596824"/>
       <w:r>
         <w:lastRenderedPageBreak/>
         <w:t xml:space="preserve">6. Módulo de autenticación (RF-01 </w:t>
@@ -16172,7 +16179,7 @@
       <w:pPr>
         <w:pStyle w:val="Ttulo2"/>
       </w:pPr>
-      <w:bookmarkStart w:id="21" w:name="_Toc243596222"/>
+      <w:bookmarkStart w:id="21" w:name="_Toc243596825"/>
       <w:r>
         <w:t>6.1 Especificación de los casos de uso</w:t>
       </w:r>
@@ -17054,7 +17061,7 @@
                 <w:sz w:val="19"/>
                 <w:szCs w:val="19"/>
               </w:rPr>
-              <w:t>Verifica que la cédula, el carnet y el correo no estén registrados.</w:t>
+              <w:t>Crea el usuario en Firebase Auth, que rechaza el correo si ya está registrado.</w:t>
             </w:r>
           </w:p>
         </w:tc>
@@ -17147,7 +17154,14 @@
                 <w:sz w:val="19"/>
                 <w:szCs w:val="19"/>
               </w:rPr>
-              <w:t>Crea el usuario en Firebase Auth y su documento en la colección usuarios con rol estudiante, estado activo y solvente.</w:t>
+              <w:t>Guarda en una sola escritura el documento del usuario (rol estudiante, estado activo y solvente) y los índices de su cédula y su carnet; las reglas la rechazan si al</w:t>
+            </w:r>
+            <w:r>
+              <w:rPr>
+                <w:sz w:val="19"/>
+                <w:szCs w:val="19"/>
+              </w:rPr>
+              <w:t>guno ya existe.</w:t>
             </w:r>
           </w:p>
         </w:tc>
@@ -17241,14 +17255,7 @@
                 <w:sz w:val="19"/>
                 <w:szCs w:val="19"/>
               </w:rPr>
-              <w:t>Envía el correo de verificación, abre la sesión y mu</w:t>
-            </w:r>
-            <w:r>
-              <w:rPr>
-                <w:sz w:val="19"/>
-                <w:szCs w:val="19"/>
-              </w:rPr>
-              <w:t>estra el catálogo con el aviso "Te enviamos un correo de verificación". El caso de uso finaliza.</w:t>
+              <w:t>Envía el correo de verificación, abre la sesión y muestra el catálogo con el aviso "Te enviamos un correo de verificación". El caso de uso finaliza.</w:t>
             </w:r>
           </w:p>
         </w:tc>
@@ -17344,7 +17351,7 @@
                 <w:sz w:val="19"/>
                 <w:szCs w:val="19"/>
               </w:rPr>
-              <w:t>A2. Cédula, carnet o correo ya registrados (paso 3)</w:t>
+              <w:t>A2. Correo, cédula o carnet ya registrados (pasos 3 y 4)</w:t>
             </w:r>
           </w:p>
           <w:p>
@@ -17356,14 +17363,14 @@
                 <w:sz w:val="19"/>
                 <w:szCs w:val="19"/>
               </w:rPr>
-              <w:t>Informa cuál dato ya existe y ofrece los botones "Iniciar sesió</w:t>
-            </w:r>
-            <w:r>
-              <w:rPr>
-                <w:sz w:val="19"/>
-                <w:szCs w:val="19"/>
-              </w:rPr>
-              <w:t>n" y "Recuperar contraseña". El caso de uso finaliza.</w:t>
+              <w:t xml:space="preserve">Si la cédula o el </w:t>
+            </w:r>
+            <w:r>
+              <w:rPr>
+                <w:sz w:val="19"/>
+                <w:szCs w:val="19"/>
+              </w:rPr>
+              <w:t>carnet ya existen, borra la cuenta recién creada en Firebase Auth. Informa cuál dato ya existe y ofrece los botones "Iniciar sesión" y "Recuperar contraseña". El caso de uso finaliza.</w:t>
             </w:r>
           </w:p>
         </w:tc>
@@ -17431,7 +17438,14 @@
                 <w:sz w:val="19"/>
                 <w:szCs w:val="19"/>
               </w:rPr>
-              <w:t>Existe una cuenta de Estudiante con la sesión abierta, pendiente de verificar el correo.</w:t>
+              <w:t xml:space="preserve">Existe una cuenta de Estudiante con la sesión abierta, </w:t>
+            </w:r>
+            <w:r>
+              <w:rPr>
+                <w:sz w:val="19"/>
+                <w:szCs w:val="19"/>
+              </w:rPr>
+              <w:t>pendiente de verificar el correo.</w:t>
             </w:r>
           </w:p>
         </w:tc>
@@ -20181,7 +20195,7 @@
       <w:pPr>
         <w:pStyle w:val="Ttulo2"/>
       </w:pPr>
-      <w:bookmarkStart w:id="22" w:name="_Toc243596223"/>
+      <w:bookmarkStart w:id="22" w:name="_Toc243596826"/>
       <w:r>
         <w:t>6.2 Diagramas de secuencia</w:t>
       </w:r>
@@ -20206,8 +20220,8 @@
           <w:noProof/>
         </w:rPr>
         <w:drawing>
-          <wp:inline distT="0" distB="0" distL="0" distR="0" wp14:anchorId="348E2965" wp14:editId="4CD6EA12">
-            <wp:extent cx="5943600" cy="4448175"/>
+          <wp:inline distT="0" distB="0" distL="0" distR="0" wp14:anchorId="527C2040" wp14:editId="7EEE1056">
+            <wp:extent cx="5943600" cy="5153025"/>
             <wp:effectExtent l="0" t="0" r="0" b="0"/>
             <wp:docPr id="7" name="16_seq_registro.png" descr="Secuencia de CU-01 Registrarse." title="Secuencia de CU-01 Registrarse."/>
             <wp:cNvGraphicFramePr>
@@ -20232,7 +20246,7 @@
                   <pic:spPr bwMode="auto">
                     <a:xfrm>
                       <a:off x="0" y="0"/>
-                      <a:ext cx="5943600" cy="4448175"/>
+                      <a:ext cx="5943600" cy="5153025"/>
                     </a:xfrm>
                     <a:prstGeom prst="rect">
                       <a:avLst/>
@@ -20283,7 +20297,7 @@
         </w:rPr>
         <w:lastRenderedPageBreak/>
         <w:drawing>
-          <wp:inline distT="0" distB="0" distL="0" distR="0" wp14:anchorId="6BDEA155" wp14:editId="56E03031">
+          <wp:inline distT="0" distB="0" distL="0" distR="0" wp14:anchorId="0DF5B253" wp14:editId="25C6D007">
             <wp:extent cx="5943600" cy="5324475"/>
             <wp:effectExtent l="0" t="0" r="0" b="0"/>
             <wp:docPr id="8" name="17_seq_login.png" descr="Secuencia de CU-02 Iniciar sesión, con la guardia de rutas." title="Secuencia de CU-02 Iniciar sesión, con la guardia de rutas."/>
@@ -20360,7 +20374,7 @@
         </w:rPr>
         <w:lastRenderedPageBreak/>
         <w:drawing>
-          <wp:inline distT="0" distB="0" distL="0" distR="0" wp14:anchorId="71A59A72" wp14:editId="7922EEA9">
+          <wp:inline distT="0" distB="0" distL="0" distR="0" wp14:anchorId="57276705" wp14:editId="1DA819CA">
             <wp:extent cx="5943600" cy="3838575"/>
             <wp:effectExtent l="0" t="0" r="0" b="0"/>
             <wp:docPr id="9" name="18_seq_recuperar.png" descr="Secuencia de CU-02, flujo alternativo A3: recuperar la contraseña." title="Secuencia de CU-02, flujo alternativo A3: recuperar la contraseña."/>
@@ -20437,7 +20451,7 @@
         </w:rPr>
         <w:lastRenderedPageBreak/>
         <w:drawing>
-          <wp:inline distT="0" distB="0" distL="0" distR="0" wp14:anchorId="4C2AD549" wp14:editId="22453028">
+          <wp:inline distT="0" distB="0" distL="0" distR="0" wp14:anchorId="54F20E3B" wp14:editId="6518E1F2">
             <wp:extent cx="5943600" cy="4752975"/>
             <wp:effectExtent l="0" t="0" r="0" b="0"/>
             <wp:docPr id="10" name="19_seq_perfil.png" descr="Secuencia de CU-03 Gestionar perfil." title="Secuencia de CU-03 Gestionar perfil."/>
@@ -20506,7 +20520,7 @@
       <w:pPr>
         <w:pStyle w:val="Ttulo2"/>
       </w:pPr>
-      <w:bookmarkStart w:id="23" w:name="_Toc243596224"/>
+      <w:bookmarkStart w:id="23" w:name="_Toc243596827"/>
       <w:r>
         <w:t xml:space="preserve">6.3 Reglas de </w:t>
       </w:r>
@@ -21488,7 +21502,7 @@
       <w:pPr>
         <w:pStyle w:val="Ttulo2"/>
       </w:pPr>
-      <w:bookmarkStart w:id="24" w:name="_Toc243596225"/>
+      <w:bookmarkStart w:id="24" w:name="_Toc243596828"/>
       <w:r>
         <w:t>6.4 Pantallas implementadas</w:t>
       </w:r>
@@ -21513,7 +21527,7 @@
           <w:noProof/>
         </w:rPr>
         <w:drawing>
-          <wp:inline distT="0" distB="0" distL="0" distR="0" wp14:anchorId="535531D1" wp14:editId="0664FD1D">
+          <wp:inline distT="0" distB="0" distL="0" distR="0" wp14:anchorId="06A0EC11" wp14:editId="668CF1E9">
             <wp:extent cx="5943600" cy="3048000"/>
             <wp:effectExtent l="0" t="0" r="0" b="0"/>
             <wp:docPr id="11" name="c1_inicio_login.png" descr="Inicio, inicio de sesión, correo con formato inválido (A1) y credenciales incorrectas (A2)." title="Inicio, inicio de sesión, correo con formato inválido (A1) y credenciales incorrectas (A2)."/>
@@ -21590,7 +21604,7 @@
         </w:rPr>
         <w:lastRenderedPageBreak/>
         <w:drawing>
-          <wp:inline distT="0" distB="0" distL="0" distR="0" wp14:anchorId="6B4F015F" wp14:editId="50F4906C">
+          <wp:inline distT="0" distB="0" distL="0" distR="0" wp14:anchorId="48295827" wp14:editId="7527A835">
             <wp:extent cx="5943600" cy="5695950"/>
             <wp:effectExtent l="0" t="0" r="0" b="0"/>
             <wp:docPr id="12" name="c2_registro.png" descr="Registro: formulario, errores de formato (A1) y cuenta ya existente con las opciones de A2." title="Registro: formulario, errores de formato (A1) y cuenta ya existente con las opciones de A2."/>
@@ -21677,7 +21691,7 @@
         </w:rPr>
         <w:lastRenderedPageBreak/>
         <w:drawing>
-          <wp:inline distT="0" distB="0" distL="0" distR="0" wp14:anchorId="51556343" wp14:editId="53CDEDFC">
+          <wp:inline distT="0" distB="0" distL="0" distR="0" wp14:anchorId="0D6CE381" wp14:editId="25609538">
             <wp:extent cx="5286375" cy="4000500"/>
             <wp:effectExtent l="0" t="0" r="0" b="0"/>
             <wp:docPr id="13" name="c3_exito_recuperar.png" descr="Registro exitoso con el aviso de verificación, y recuperación de la contraseña (A3)." title="Registro exitoso con el aviso de verificación, y recuperación de la contraseña (A3)."/>
@@ -21753,7 +21767,7 @@
           <w:noProof/>
         </w:rPr>
         <w:drawing>
-          <wp:inline distT="0" distB="0" distL="0" distR="0" wp14:anchorId="1E2FC4ED" wp14:editId="29A26C8D">
+          <wp:inline distT="0" distB="0" distL="0" distR="0" wp14:anchorId="05495885" wp14:editId="69D58B41">
             <wp:extent cx="5943600" cy="3048000"/>
             <wp:effectExtent l="0" t="0" r="0" b="0"/>
             <wp:docPr id="14" name="c4_perfil.png" descr="Inicio del estudiante (pantalla provisional), perfil del estudiante, perfil guardado y perfil del entrenador." title="Inicio del estudiante (pantalla provisional), perfil del estudiante, perfil guardado y perfil del entrenador."/>
@@ -21840,7 +21854,7 @@
         </w:rPr>
         <w:lastRenderedPageBreak/>
         <w:drawing>
-          <wp:inline distT="0" distB="0" distL="0" distR="0" wp14:anchorId="572B1664" wp14:editId="2B06EADF">
+          <wp:inline distT="0" distB="0" distL="0" distR="0" wp14:anchorId="404C2B82" wp14:editId="452DED79">
             <wp:extent cx="4953000" cy="3095625"/>
             <wp:effectExtent l="0" t="0" r="0" b="0"/>
             <wp:docPr id="15" name="c5_login_escritorio.png" descr="Inicio de sesión en escritorio: el formulario se muestra como una tarjeta centrada (RNF-01)." title="Inicio de sesión en escritorio: el formulario se muestra como una tarjeta centrada (RNF-01)."/>
@@ -21910,7 +21924,7 @@
         <w:pStyle w:val="Ttulo1"/>
         <w:pageBreakBefore/>
       </w:pPr>
-      <w:bookmarkStart w:id="25" w:name="_Toc243596226"/>
+      <w:bookmarkStart w:id="25" w:name="_Toc243596829"/>
       <w:r>
         <w:lastRenderedPageBreak/>
         <w:t>7. Estructura base para la gestión deportiva</w:t>
@@ -23022,7 +23036,7 @@
                 <w:sz w:val="19"/>
                 <w:szCs w:val="19"/>
               </w:rPr>
-              <w:t>Escribir su nombre en la columna Responsable de las tablas 2.1 y de esta sección.</w:t>
+              <w:t>Escribir su nombre en la columna Responsable de la tabla 2.1 y de la tabla de esta sección.</w:t>
             </w:r>
           </w:p>
           <w:p>
@@ -23056,14 +23070,14 @@
                 <w:sz w:val="19"/>
                 <w:szCs w:val="19"/>
               </w:rPr>
-              <w:t>Riesgo técnico que</w:t>
-            </w:r>
-            <w:r>
-              <w:rPr>
-                <w:sz w:val="19"/>
-                <w:szCs w:val="19"/>
-              </w:rPr>
-              <w:t xml:space="preserve"> le toca validar en la Elaboración: R3 (transacción de cupos) para RF-08 y R4 (PayPal sandbox) para RF-09. Anotar el resultado en la sección 10.</w:t>
+              <w:t>Riesgo t</w:t>
+            </w:r>
+            <w:r>
+              <w:rPr>
+                <w:sz w:val="19"/>
+                <w:szCs w:val="19"/>
+              </w:rPr>
+              <w:t>écnico que le toca validar en la Elaboración: R3 (transacción de cupos) para RF-08 y R4 (PayPal sandbox) para RF-09. Anotar el resultado en la sección 10.</w:t>
             </w:r>
           </w:p>
         </w:tc>
@@ -23079,7 +23093,7 @@
         <w:pStyle w:val="Ttulo1"/>
         <w:pageBreakBefore/>
       </w:pPr>
-      <w:bookmarkStart w:id="26" w:name="_Toc243596227"/>
+      <w:bookmarkStart w:id="26" w:name="_Toc243596830"/>
       <w:r>
         <w:lastRenderedPageBreak/>
         <w:t>8. Pruebas de la arquitectura y del flujo de autenticación</w:t>
@@ -27934,7 +27948,7 @@
       <w:pPr>
         <w:pStyle w:val="Ttulo2"/>
       </w:pPr>
-      <w:bookmarkStart w:id="27" w:name="_Toc243596228"/>
+      <w:bookmarkStart w:id="27" w:name="_Toc243596831"/>
       <w:r>
         <w:t>8.1 Hallazgos de las pruebas</w:t>
       </w:r>
@@ -28080,7 +28094,7 @@
         <w:pStyle w:val="Ttulo1"/>
         <w:pageBreakBefore/>
       </w:pPr>
-      <w:bookmarkStart w:id="28" w:name="_Toc243596229"/>
+      <w:bookmarkStart w:id="28" w:name="_Toc243596832"/>
       <w:r>
         <w:lastRenderedPageBreak/>
         <w:t>9. Plan de iteración: fase de Elaboración</w:t>
@@ -29431,7 +29445,7 @@
       <w:pPr>
         <w:pStyle w:val="Ttulo2"/>
       </w:pPr>
-      <w:bookmarkStart w:id="29" w:name="_Toc243596230"/>
+      <w:bookmarkStart w:id="29" w:name="_Toc243596833"/>
       <w:r>
         <w:t>9.1 Criterios de evaluación de la iteración</w:t>
       </w:r>
@@ -29510,7 +29524,7 @@
         <w:pStyle w:val="Ttulo1"/>
         <w:pageBreakBefore/>
       </w:pPr>
-      <w:bookmarkStart w:id="30" w:name="_Toc243596231"/>
+      <w:bookmarkStart w:id="30" w:name="_Toc243596834"/>
       <w:r>
         <w:lastRenderedPageBreak/>
         <w:t>10. Riesgos actualizados</w:t>
@@ -30925,7 +30939,7 @@
         <w:pStyle w:val="Ttulo1"/>
         <w:pageBreakBefore/>
       </w:pPr>
-      <w:bookmarkStart w:id="31" w:name="_Toc243596232"/>
+      <w:bookmarkStart w:id="31" w:name="_Toc243596835"/>
       <w:r>
         <w:lastRenderedPageBreak/>
         <w:t>11. Repositorio y colaboración</w:t>
@@ -30960,7 +30974,7 @@
       <w:pPr>
         <w:pStyle w:val="Ttulo2"/>
       </w:pPr>
-      <w:bookmarkStart w:id="32" w:name="_Toc243596233"/>
+      <w:bookmarkStart w:id="32" w:name="_Toc243596836"/>
       <w:r>
         <w:t>11.1 Commits de la Elaboración</w:t>
       </w:r>
@@ -32143,10 +32157,10 @@
 <file path=word/numbering.xml><?xml version="1.0" encoding="utf-8"?>
 <w:numbering xmlns:wpc="http://schemas.microsoft.com/office/word/2010/wordprocessingCanvas" xmlns:cx="http://schemas.microsoft.com/office/drawing/2014/chartex" xmlns:cx1="http://schemas.microsoft.com/office/drawing/2015/9/8/chartex" xmlns:cx2="http://schemas.microsoft.com/office/drawing/2015/10/21/chartex" xmlns:cx3="http://schemas.microsoft.com/office/drawing/2016/5/9/chartex" xmlns:cx4="http://schemas.microsoft.com/office/drawing/2016/5/10/chartex" xmlns:cx5="http://schemas.microsoft.com/office/drawing/2016/5/11/chartex" xmlns:cx6="http://schemas.microsoft.com/office/drawing/2016/5/12/chartex" xmlns:cx7="http://schemas.microsoft.com/office/drawing/2016/5/13/chartex" xmlns:cx8="http://schemas.microsoft.com/office/drawing/2016/5/14/chartex" xmlns:mc="http://schemas.openxmlformats.org/markup-compatibility/2006" xmlns:aink="http://schemas.microsoft.com/office/drawing/2016/ink" xmlns:am3d="http://schemas.microsoft.com/office/drawing/2017/model3d" xmlns:o="urn:schemas-microsoft-com:office:office" xmlns:r="http://schemas.openxmlformats.org/officeDocument/2006/relationships" xmlns:m="http://schemas.openxmlformats.org/officeDocument/2006/math" xmlns:v="urn:schemas-microsoft-com:vml" xmlns:wp14="http://schemas.microsoft.com/office/word/2010/wordprocessingDrawing" xmlns:wp="http://schemas.openxmlformats.org/drawingml/2006/wordprocessingDrawing" xmlns:w10="urn:schemas-microsoft-com:office:word" xmlns:w="http://schemas.openxmlformats.org/wordprocessingml/2006/main" xmlns:w14="http://schemas.microsoft.com/office/word/2010/wordml" xmlns:w15="http://schemas.microsoft.com/office/word/2012/wordml" xmlns:w16cex="http://schemas.microsoft.com/office/word/2018/wordml/cex" xmlns:w16cid="http://schemas.microsoft.com/office/word/2016/wordml/cid" xmlns:w16="http://schemas.microsoft.com/office/word/2018/wordml" xmlns:w16sdtdh="http://schemas.microsoft.com/office/word/2020/wordml/sdtdatahash" xmlns:w16se="http://schemas.microsoft.com/office/word/2015/wordml/symex" xmlns:wpg="http://schemas.microsoft.com/office/word/2010/wordprocessingGroup" xmlns:wpi="http://schemas.microsoft.com/office/word/2010/wordprocessingInk" xmlns:wne="http://schemas.microsoft.com/office/word/2006/wordml" xmlns:wps="http://schemas.microsoft.com/office/word/2010/wordprocessingShape" mc:Ignorable="w14 w15 w16se w16cid w16 w16cex w16sdtdh wp14">
   <w:abstractNum w:abstractNumId="0" w15:restartNumberingAfterBreak="0">
-    <w:nsid w:val="1F1F302B"/>
+    <w:nsid w:val="0B544D46"/>
     <w:multiLevelType w:val="hybridMultilevel"/>
-    <w:tmpl w:val="2618C352"/>
-    <w:lvl w:ilvl="0" w:tplc="C00865D2">
+    <w:tmpl w:val="74C2B42A"/>
+    <w:lvl w:ilvl="0" w:tplc="2EBC5EC0">
       <w:start w:val="1"/>
       <w:numFmt w:val="bullet"/>
       <w:lvlText w:val="•"/>
@@ -32155,7 +32169,7 @@
         <w:ind w:left="540" w:hanging="270"/>
       </w:pPr>
     </w:lvl>
-    <w:lvl w:ilvl="1" w:tplc="9328FF6A" w:tentative="1">
+    <w:lvl w:ilvl="1" w:tplc="89F85994" w:tentative="1">
       <w:start w:val="1"/>
       <w:numFmt w:val="bullet"/>
       <w:lvlText w:val="–"/>
@@ -32164,47 +32178,47 @@
         <w:ind w:left="1000" w:hanging="270"/>
       </w:pPr>
     </w:lvl>
-    <w:lvl w:ilvl="2" w:tplc="32622518">
+    <w:lvl w:ilvl="2" w:tplc="F0161784">
       <w:numFmt w:val="decimal"/>
       <w:lvlText w:val=""/>
       <w:lvlJc w:val="left"/>
     </w:lvl>
-    <w:lvl w:ilvl="3" w:tplc="4F26E710">
+    <w:lvl w:ilvl="3" w:tplc="758CE00E">
       <w:numFmt w:val="decimal"/>
       <w:lvlText w:val=""/>
       <w:lvlJc w:val="left"/>
     </w:lvl>
-    <w:lvl w:ilvl="4" w:tplc="03563510">
+    <w:lvl w:ilvl="4" w:tplc="3EB87FC8">
       <w:numFmt w:val="decimal"/>
       <w:lvlText w:val=""/>
       <w:lvlJc w:val="left"/>
     </w:lvl>
-    <w:lvl w:ilvl="5" w:tplc="3774E5B4">
+    <w:lvl w:ilvl="5" w:tplc="B3D6BED4">
       <w:numFmt w:val="decimal"/>
       <w:lvlText w:val=""/>
       <w:lvlJc w:val="left"/>
     </w:lvl>
-    <w:lvl w:ilvl="6" w:tplc="A6860E4C">
+    <w:lvl w:ilvl="6" w:tplc="404AC86C">
       <w:numFmt w:val="decimal"/>
       <w:lvlText w:val=""/>
       <w:lvlJc w:val="left"/>
     </w:lvl>
-    <w:lvl w:ilvl="7" w:tplc="E162F514">
+    <w:lvl w:ilvl="7" w:tplc="809A3542">
       <w:numFmt w:val="decimal"/>
       <w:lvlText w:val=""/>
       <w:lvlJc w:val="left"/>
     </w:lvl>
-    <w:lvl w:ilvl="8" w:tplc="A9F0D4EC">
+    <w:lvl w:ilvl="8" w:tplc="6D943F10">
       <w:numFmt w:val="decimal"/>
       <w:lvlText w:val=""/>
       <w:lvlJc w:val="left"/>
     </w:lvl>
   </w:abstractNum>
   <w:abstractNum w:abstractNumId="1" w15:restartNumberingAfterBreak="0">
-    <w:nsid w:val="53CE559D"/>
+    <w:nsid w:val="56862AA8"/>
     <w:multiLevelType w:val="hybridMultilevel"/>
-    <w:tmpl w:val="40FC7768"/>
-    <w:lvl w:ilvl="0" w:tplc="31863748" w:tentative="1">
+    <w:tmpl w:val="67A218C2"/>
+    <w:lvl w:ilvl="0" w:tplc="423EBB4A" w:tentative="1">
       <w:start w:val="1"/>
       <w:numFmt w:val="bullet"/>
       <w:lvlText w:val="●"/>
@@ -32213,7 +32227,7 @@
         <w:ind w:left="720" w:hanging="360"/>
       </w:pPr>
     </w:lvl>
-    <w:lvl w:ilvl="1" w:tplc="386265F4" w:tentative="1">
+    <w:lvl w:ilvl="1" w:tplc="78C80E40" w:tentative="1">
       <w:start w:val="1"/>
       <w:numFmt w:val="bullet"/>
       <w:lvlText w:val="○"/>
@@ -32222,7 +32236,7 @@
         <w:ind w:left="1440" w:hanging="360"/>
       </w:pPr>
     </w:lvl>
-    <w:lvl w:ilvl="2" w:tplc="A9386C86" w:tentative="1">
+    <w:lvl w:ilvl="2" w:tplc="17D470E8" w:tentative="1">
       <w:start w:val="1"/>
       <w:numFmt w:val="bullet"/>
       <w:lvlText w:val="■"/>
@@ -32231,7 +32245,7 @@
         <w:ind w:left="2160" w:hanging="360"/>
       </w:pPr>
     </w:lvl>
-    <w:lvl w:ilvl="3" w:tplc="EAF2C9B8" w:tentative="1">
+    <w:lvl w:ilvl="3" w:tplc="DA4C330C" w:tentative="1">
       <w:start w:val="1"/>
       <w:numFmt w:val="bullet"/>
       <w:lvlText w:val="●"/>
@@ -32240,7 +32254,7 @@
         <w:ind w:left="2880" w:hanging="360"/>
       </w:pPr>
     </w:lvl>
-    <w:lvl w:ilvl="4" w:tplc="41501E4C" w:tentative="1">
+    <w:lvl w:ilvl="4" w:tplc="BA189C94" w:tentative="1">
       <w:start w:val="1"/>
       <w:numFmt w:val="bullet"/>
       <w:lvlText w:val="○"/>
@@ -32249,7 +32263,7 @@
         <w:ind w:left="3600" w:hanging="360"/>
       </w:pPr>
     </w:lvl>
-    <w:lvl w:ilvl="5" w:tplc="9934F4BE" w:tentative="1">
+    <w:lvl w:ilvl="5" w:tplc="7EECAE54" w:tentative="1">
       <w:start w:val="1"/>
       <w:numFmt w:val="bullet"/>
       <w:lvlText w:val="■"/>
@@ -32258,7 +32272,7 @@
         <w:ind w:left="4320" w:hanging="360"/>
       </w:pPr>
     </w:lvl>
-    <w:lvl w:ilvl="6" w:tplc="CAB078B0" w:tentative="1">
+    <w:lvl w:ilvl="6" w:tplc="4AA0707A" w:tentative="1">
       <w:start w:val="1"/>
       <w:numFmt w:val="bullet"/>
       <w:lvlText w:val="●"/>
@@ -32267,7 +32281,7 @@
         <w:ind w:left="5040" w:hanging="360"/>
       </w:pPr>
     </w:lvl>
-    <w:lvl w:ilvl="7" w:tplc="6E3C4CB6" w:tentative="1">
+    <w:lvl w:ilvl="7" w:tplc="7AA80AB4" w:tentative="1">
       <w:start w:val="1"/>
       <w:numFmt w:val="bullet"/>
       <w:lvlText w:val="●"/>
@@ -32276,7 +32290,7 @@
         <w:ind w:left="5760" w:hanging="360"/>
       </w:pPr>
     </w:lvl>
-    <w:lvl w:ilvl="8" w:tplc="745E96F8" w:tentative="1">
+    <w:lvl w:ilvl="8" w:tplc="DEF4FB4C" w:tentative="1">
       <w:start w:val="1"/>
       <w:numFmt w:val="bullet"/>
       <w:lvlText w:val="●"/>
@@ -32953,7 +32967,7 @@
     <w:autoRedefine/>
     <w:uiPriority w:val="39"/>
     <w:unhideWhenUsed/>
-    <w:rsid w:val="00967E32"/>
+    <w:rsid w:val="00E86CDE"/>
     <w:pPr>
       <w:spacing w:after="100"/>
     </w:pPr>
@@ -32965,7 +32979,7 @@
     <w:autoRedefine/>
     <w:uiPriority w:val="39"/>
     <w:unhideWhenUsed/>
-    <w:rsid w:val="00967E32"/>
+    <w:rsid w:val="00E86CDE"/>
     <w:pPr>
       <w:spacing w:after="100"/>
       <w:ind w:left="210"/>

</xml_diff>